<commit_message>
Guion del pitch, slides e informe actualizado
Guion para los 5 minutos de pitch, con el texto que dice cada uno de los cinco
integrantes en parrafos para leer, calibrado a 145 palabras por minuto y con el
material opcional marcado para poder recortar en el ensayo. Un bloque entero
esta dedicado al flujo y a los cuatro pilares, que es lo que pide la consigna.
Incluye el banco de preguntas de los 3 minutos de Q&A con las respuestas ya
redactadas.

Queda anotada una inconsistencia sin resolver: la slide del problema dice 25 a
30 alumnos por aula y el informe apunta a escuelas privadas con aulas de 20.

Co-Authored-By: Claude Opus 5 <noreply@anthropic.com>
</commit_message>
<xml_diff>
--- a/app educativa.docx
+++ b/app educativa.docx
@@ -176,7 +176,23 @@
           <w:sz w:val="28"/>
           <w:szCs w:val="28"/>
         </w:rPr>
-        <w:t xml:space="preserve">De los Santos, Estevez Castellano, Hsieh, Jeifetz y </w:t>
+        <w:t xml:space="preserve">De los Santos, Estevez Castellano, Hsieh, </w:t>
+      </w:r>
+      <w:proofErr w:type="spellStart"/>
+      <w:r>
+        <w:rPr>
+          <w:sz w:val="28"/>
+          <w:szCs w:val="28"/>
+        </w:rPr>
+        <w:t>Jeifetz</w:t>
+      </w:r>
+      <w:proofErr w:type="spellEnd"/>
+      <w:r>
+        <w:rPr>
+          <w:sz w:val="28"/>
+          <w:szCs w:val="28"/>
+        </w:rPr>
+        <w:t xml:space="preserve"> y </w:t>
       </w:r>
       <w:proofErr w:type="spellStart"/>
       <w:r>
@@ -285,7 +301,7 @@
       <w:sdtContent>
         <w:p>
           <w:pPr>
-            <w:pStyle w:val="TtuloTDC"/>
+            <w:pStyle w:val="TOCHeading"/>
             <w:rPr>
               <w:color w:val="auto"/>
               <w:sz w:val="36"/>
@@ -304,7 +320,7 @@
         </w:p>
         <w:p>
           <w:pPr>
-            <w:pStyle w:val="TDC2"/>
+            <w:pStyle w:val="TOC2"/>
             <w:tabs>
               <w:tab w:val="right" w:leader="dot" w:pos="8494"/>
             </w:tabs>
@@ -326,7 +342,7 @@
           <w:hyperlink w:anchor="_Toc240891398" w:history="1">
             <w:r>
               <w:rPr>
-                <w:rStyle w:val="Hipervnculo"/>
+                <w:rStyle w:val="Hyperlink"/>
                 <w:b/>
                 <w:bCs/>
                 <w:noProof/>
@@ -385,7 +401,7 @@
         </w:p>
         <w:p>
           <w:pPr>
-            <w:pStyle w:val="TDC3"/>
+            <w:pStyle w:val="TOC3"/>
             <w:rPr>
               <w:rFonts w:eastAsiaTheme="minorEastAsia"/>
               <w:lang w:eastAsia="es-AR"/>
@@ -394,7 +410,7 @@
           <w:hyperlink w:anchor="_Toc240891399" w:history="1">
             <w:r>
               <w:rPr>
-                <w:rStyle w:val="Hipervnculo"/>
+                <w:rStyle w:val="Hyperlink"/>
               </w:rPr>
               <w:t>Público objetivo</w:t>
             </w:r>
@@ -443,7 +459,7 @@
         </w:p>
         <w:p>
           <w:pPr>
-            <w:pStyle w:val="TDC3"/>
+            <w:pStyle w:val="TOC3"/>
             <w:rPr>
               <w:rFonts w:eastAsiaTheme="minorEastAsia"/>
               <w:lang w:eastAsia="es-AR"/>
@@ -452,7 +468,7 @@
           <w:hyperlink w:anchor="_Toc240891400" w:history="1">
             <w:r>
               <w:rPr>
-                <w:rStyle w:val="Hipervnculo"/>
+                <w:rStyle w:val="Hyperlink"/>
               </w:rPr>
               <w:t>Por qué hoy fracasa</w:t>
             </w:r>
@@ -501,7 +517,7 @@
         </w:p>
         <w:p>
           <w:pPr>
-            <w:pStyle w:val="TDC3"/>
+            <w:pStyle w:val="TOC3"/>
             <w:rPr>
               <w:rFonts w:eastAsiaTheme="minorEastAsia"/>
               <w:lang w:eastAsia="es-AR"/>
@@ -510,7 +526,7 @@
           <w:hyperlink w:anchor="_Toc240891401" w:history="1">
             <w:r>
               <w:rPr>
-                <w:rStyle w:val="Hipervnculo"/>
+                <w:rStyle w:val="Hyperlink"/>
               </w:rPr>
               <w:t>AMI: qué hace y por qué se llama así</w:t>
             </w:r>
@@ -559,7 +575,7 @@
         </w:p>
         <w:p>
           <w:pPr>
-            <w:pStyle w:val="TDC2"/>
+            <w:pStyle w:val="TOC2"/>
             <w:tabs>
               <w:tab w:val="right" w:leader="dot" w:pos="8494"/>
             </w:tabs>
@@ -572,7 +588,7 @@
           <w:hyperlink w:anchor="_Toc240891402" w:history="1">
             <w:r>
               <w:rPr>
-                <w:rStyle w:val="Hipervnculo"/>
+                <w:rStyle w:val="Hyperlink"/>
                 <w:b/>
                 <w:bCs/>
                 <w:noProof/>
@@ -631,7 +647,7 @@
         </w:p>
         <w:p>
           <w:pPr>
-            <w:pStyle w:val="TDC3"/>
+            <w:pStyle w:val="TOC3"/>
             <w:rPr>
               <w:rFonts w:eastAsiaTheme="minorEastAsia"/>
               <w:lang w:eastAsia="es-AR"/>
@@ -640,7 +656,7 @@
           <w:hyperlink w:anchor="_Toc240891403" w:history="1">
             <w:r>
               <w:rPr>
-                <w:rStyle w:val="Hipervnculo"/>
+                <w:rStyle w:val="Hyperlink"/>
                 <w:color w:val="auto"/>
               </w:rPr>
               <w:t>Atención y práctica deliberada</w:t>
@@ -690,7 +706,7 @@
         </w:p>
         <w:p>
           <w:pPr>
-            <w:pStyle w:val="TDC3"/>
+            <w:pStyle w:val="TOC3"/>
             <w:rPr>
               <w:rFonts w:eastAsiaTheme="minorEastAsia"/>
               <w:lang w:eastAsia="es-AR"/>
@@ -699,7 +715,7 @@
           <w:hyperlink w:anchor="_Toc240891404" w:history="1">
             <w:r>
               <w:rPr>
-                <w:rStyle w:val="Hipervnculo"/>
+                <w:rStyle w:val="Hyperlink"/>
               </w:rPr>
               <w:t>Feedback constructivo</w:t>
             </w:r>
@@ -748,7 +764,7 @@
         </w:p>
         <w:p>
           <w:pPr>
-            <w:pStyle w:val="TDC3"/>
+            <w:pStyle w:val="TOC3"/>
             <w:rPr>
               <w:rFonts w:eastAsiaTheme="minorEastAsia"/>
               <w:lang w:eastAsia="es-AR"/>
@@ -757,7 +773,7 @@
           <w:hyperlink w:anchor="_Toc240891405" w:history="1">
             <w:r>
               <w:rPr>
-                <w:rStyle w:val="Hipervnculo"/>
+                <w:rStyle w:val="Hyperlink"/>
               </w:rPr>
               <w:t>Motivación intrínseca vs extrínseca</w:t>
             </w:r>
@@ -806,7 +822,7 @@
         </w:p>
         <w:p>
           <w:pPr>
-            <w:pStyle w:val="TDC3"/>
+            <w:pStyle w:val="TOC3"/>
             <w:rPr>
               <w:rFonts w:eastAsiaTheme="minorEastAsia"/>
               <w:lang w:eastAsia="es-AR"/>
@@ -815,7 +831,7 @@
           <w:hyperlink w:anchor="_Toc240891406" w:history="1">
             <w:r>
               <w:rPr>
-                <w:rStyle w:val="Hipervnculo"/>
+                <w:rStyle w:val="Hyperlink"/>
               </w:rPr>
               <w:t>Consolidación y naturaleza multiplicativa del conocimiento</w:t>
             </w:r>
@@ -864,7 +880,7 @@
         </w:p>
         <w:p>
           <w:pPr>
-            <w:pStyle w:val="TDC2"/>
+            <w:pStyle w:val="TOC2"/>
             <w:tabs>
               <w:tab w:val="right" w:leader="dot" w:pos="8494"/>
             </w:tabs>
@@ -877,7 +893,7 @@
           <w:hyperlink w:anchor="_Toc240891407" w:history="1">
             <w:r>
               <w:rPr>
-                <w:rStyle w:val="Hipervnculo"/>
+                <w:rStyle w:val="Hyperlink"/>
                 <w:b/>
                 <w:bCs/>
                 <w:noProof/>
@@ -936,7 +952,7 @@
         </w:p>
         <w:p>
           <w:pPr>
-            <w:pStyle w:val="TDC3"/>
+            <w:pStyle w:val="TOC3"/>
             <w:rPr>
               <w:rFonts w:eastAsiaTheme="minorEastAsia"/>
               <w:lang w:eastAsia="es-AR"/>
@@ -945,7 +961,7 @@
           <w:hyperlink w:anchor="_Toc240891408" w:history="1">
             <w:r>
               <w:rPr>
-                <w:rStyle w:val="Hipervnculo"/>
+                <w:rStyle w:val="Hyperlink"/>
               </w:rPr>
               <w:t>El costo de entrada</w:t>
             </w:r>
@@ -994,7 +1010,7 @@
         </w:p>
         <w:p>
           <w:pPr>
-            <w:pStyle w:val="TDC3"/>
+            <w:pStyle w:val="TOC3"/>
             <w:rPr>
               <w:rFonts w:eastAsiaTheme="minorEastAsia"/>
               <w:lang w:eastAsia="es-AR"/>
@@ -1003,7 +1019,7 @@
           <w:hyperlink w:anchor="_Toc240891409" w:history="1">
             <w:r>
               <w:rPr>
-                <w:rStyle w:val="Hipervnculo"/>
+                <w:rStyle w:val="Hyperlink"/>
               </w:rPr>
               <w:t>El pico y el final</w:t>
             </w:r>
@@ -1052,7 +1068,7 @@
         </w:p>
         <w:p>
           <w:pPr>
-            <w:pStyle w:val="TDC2"/>
+            <w:pStyle w:val="TOC2"/>
             <w:tabs>
               <w:tab w:val="right" w:leader="dot" w:pos="8494"/>
             </w:tabs>
@@ -1065,7 +1081,7 @@
           <w:hyperlink w:anchor="_Toc240891410" w:history="1">
             <w:r>
               <w:rPr>
-                <w:rStyle w:val="Hipervnculo"/>
+                <w:rStyle w:val="Hyperlink"/>
                 <w:b/>
                 <w:bCs/>
                 <w:noProof/>
@@ -1124,7 +1140,7 @@
         </w:p>
         <w:p>
           <w:pPr>
-            <w:pStyle w:val="TDC2"/>
+            <w:pStyle w:val="TOC2"/>
             <w:tabs>
               <w:tab w:val="right" w:leader="dot" w:pos="8494"/>
             </w:tabs>
@@ -1137,7 +1153,7 @@
           <w:hyperlink w:anchor="_Toc240891411" w:history="1">
             <w:r>
               <w:rPr>
-                <w:rStyle w:val="Hipervnculo"/>
+                <w:rStyle w:val="Hyperlink"/>
                 <w:b/>
                 <w:bCs/>
                 <w:noProof/>
@@ -1183,7 +1199,7 @@
                 <w:noProof/>
                 <w:webHidden/>
               </w:rPr>
-              <w:t>7</w:t>
+              <w:t>6</w:t>
             </w:r>
             <w:r>
               <w:rPr>
@@ -1196,7 +1212,7 @@
         </w:p>
         <w:p>
           <w:pPr>
-            <w:pStyle w:val="TDC2"/>
+            <w:pStyle w:val="TOC2"/>
             <w:tabs>
               <w:tab w:val="right" w:leader="dot" w:pos="8494"/>
             </w:tabs>
@@ -1209,7 +1225,7 @@
           <w:hyperlink w:anchor="_Toc240891412" w:history="1">
             <w:r>
               <w:rPr>
-                <w:rStyle w:val="Hipervnculo"/>
+                <w:rStyle w:val="Hyperlink"/>
                 <w:b/>
                 <w:bCs/>
                 <w:noProof/>
@@ -1268,7 +1284,7 @@
         </w:p>
         <w:p>
           <w:pPr>
-            <w:pStyle w:val="TDC2"/>
+            <w:pStyle w:val="TOC2"/>
             <w:tabs>
               <w:tab w:val="right" w:leader="dot" w:pos="8494"/>
             </w:tabs>
@@ -1281,7 +1297,7 @@
           <w:hyperlink w:anchor="_Toc240891413" w:history="1">
             <w:r>
               <w:rPr>
-                <w:rStyle w:val="Hipervnculo"/>
+                <w:rStyle w:val="Hyperlink"/>
                 <w:b/>
                 <w:bCs/>
                 <w:noProof/>
@@ -1327,7 +1343,7 @@
                 <w:noProof/>
                 <w:webHidden/>
               </w:rPr>
-              <w:t>8</w:t>
+              <w:t>7</w:t>
             </w:r>
             <w:r>
               <w:rPr>
@@ -1456,7 +1472,7 @@
     </w:p>
     <w:p>
       <w:pPr>
-        <w:pStyle w:val="Ttulo2"/>
+        <w:pStyle w:val="Heading2"/>
         <w:jc w:val="both"/>
         <w:rPr>
           <w:b/>
@@ -1482,7 +1498,7 @@
     </w:p>
     <w:p>
       <w:pPr>
-        <w:pStyle w:val="Ttulo3"/>
+        <w:pStyle w:val="Heading3"/>
         <w:jc w:val="both"/>
         <w:rPr>
           <w:i/>
@@ -1527,7 +1543,23 @@
           <w:sz w:val="22"/>
           <w:szCs w:val="22"/>
         </w:rPr>
-        <w:t xml:space="preserve"> de primer grado (6-7 años) que ya reciben instrucción fonológica del docente pero no tienen dónde practicarla de forma individual y frecuente. La primera versión apunta a </w:t>
+        <w:t xml:space="preserve"> de primer grado (6-7 años) que ya reciben instrucción fonológica del </w:t>
+      </w:r>
+      <w:proofErr w:type="gramStart"/>
+      <w:r>
+        <w:rPr>
+          <w:sz w:val="22"/>
+          <w:szCs w:val="22"/>
+        </w:rPr>
+        <w:t>docente</w:t>
+      </w:r>
+      <w:proofErr w:type="gramEnd"/>
+      <w:r>
+        <w:rPr>
+          <w:sz w:val="22"/>
+          <w:szCs w:val="22"/>
+        </w:rPr>
+        <w:t xml:space="preserve"> pero no tienen dónde practicarla de forma individual y frecuente. La primera versión apunta a </w:t>
       </w:r>
       <w:r>
         <w:rPr>
@@ -1576,7 +1608,7 @@
     </w:p>
     <w:p>
       <w:pPr>
-        <w:pStyle w:val="Ttulo3"/>
+        <w:pStyle w:val="Heading3"/>
         <w:jc w:val="both"/>
         <w:rPr>
           <w:i/>
@@ -1793,7 +1825,7 @@
     </w:p>
     <w:p>
       <w:pPr>
-        <w:pStyle w:val="Ttulo3"/>
+        <w:pStyle w:val="Heading3"/>
         <w:jc w:val="both"/>
         <w:rPr>
           <w:i/>
@@ -1882,7 +1914,7 @@
     </w:p>
     <w:p>
       <w:pPr>
-        <w:pStyle w:val="Ttulo2"/>
+        <w:pStyle w:val="Heading2"/>
         <w:jc w:val="both"/>
         <w:rPr>
           <w:b/>
@@ -1924,7 +1956,7 @@
     </w:p>
     <w:p>
       <w:pPr>
-        <w:pStyle w:val="Ttulo3"/>
+        <w:pStyle w:val="Heading3"/>
         <w:rPr>
           <w:i/>
           <w:iCs/>
@@ -2031,7 +2063,7 @@
     </w:p>
     <w:p>
       <w:pPr>
-        <w:pStyle w:val="Ttulo3"/>
+        <w:pStyle w:val="Heading3"/>
         <w:jc w:val="both"/>
         <w:rPr>
           <w:i/>
@@ -2125,7 +2157,7 @@
     </w:p>
     <w:p>
       <w:pPr>
-        <w:pStyle w:val="Ttulo3"/>
+        <w:pStyle w:val="Heading3"/>
         <w:jc w:val="both"/>
         <w:rPr>
           <w:i/>
@@ -2219,7 +2251,7 @@
     </w:p>
     <w:p>
       <w:pPr>
-        <w:pStyle w:val="Ttulo3"/>
+        <w:pStyle w:val="Heading3"/>
         <w:jc w:val="both"/>
         <w:rPr>
           <w:i/>
@@ -2285,7 +2317,7 @@
     </w:p>
     <w:p>
       <w:pPr>
-        <w:pStyle w:val="Ttulo2"/>
+        <w:pStyle w:val="Heading2"/>
         <w:jc w:val="both"/>
         <w:rPr>
           <w:b/>
@@ -2311,7 +2343,7 @@
     </w:p>
     <w:p>
       <w:pPr>
-        <w:pStyle w:val="Ttulo3"/>
+        <w:pStyle w:val="Heading3"/>
         <w:jc w:val="both"/>
         <w:rPr>
           <w:i/>
@@ -2747,7 +2779,7 @@
     </w:p>
     <w:p>
       <w:pPr>
-        <w:pStyle w:val="Ttulo3"/>
+        <w:pStyle w:val="Heading3"/>
         <w:jc w:val="both"/>
         <w:rPr>
           <w:i/>
@@ -2854,7 +2886,7 @@
     </w:p>
     <w:p>
       <w:pPr>
-        <w:pStyle w:val="Ttulo2"/>
+        <w:pStyle w:val="Heading2"/>
         <w:rPr>
           <w:b/>
           <w:bCs/>
@@ -2885,27 +2917,41 @@
         </w:rPr>
       </w:pPr>
     </w:p>
+    <w:p>
+      <w:pPr>
+        <w:jc w:val="both"/>
+        <w:rPr>
+          <w:b/>
+          <w:bCs/>
+        </w:rPr>
+      </w:pPr>
+    </w:p>
     <w:tbl>
       <w:tblPr>
-        <w:tblStyle w:val="Tablaconcuadrcula"/>
+        <w:tblStyle w:val="TableGrid"/>
         <w:tblW w:w="0" w:type="auto"/>
         <w:tblLook w:val="04A0" w:firstRow="1" w:lastRow="0" w:firstColumn="1" w:lastColumn="0" w:noHBand="0" w:noVBand="1"/>
       </w:tblPr>
       <w:tblGrid>
-        <w:gridCol w:w="4247"/>
-        <w:gridCol w:w="4247"/>
+        <w:gridCol w:w="2823"/>
+        <w:gridCol w:w="2876"/>
+        <w:gridCol w:w="2795"/>
       </w:tblGrid>
       <w:tr>
+        <w:trPr>
+          <w:trHeight w:val="6853"/>
+        </w:trPr>
         <w:tc>
           <w:tcPr>
-            <w:tcW w:w="4247" w:type="dxa"/>
+            <w:tcW w:w="2823" w:type="dxa"/>
           </w:tcPr>
           <w:p>
             <w:pPr>
-              <w:jc w:val="both"/>
-              <w:rPr>
-                <w:b/>
-                <w:bCs/>
+              <w:jc w:val="center"/>
+              <w:rPr>
+                <w:sz w:val="22"/>
+                <w:szCs w:val="22"/>
+                <w:u w:val="single"/>
               </w:rPr>
             </w:pPr>
             <w:r>
@@ -2914,12 +2960,19 @@
                 <w:bCs/>
                 <w:noProof/>
               </w:rPr>
-              <w:lastRenderedPageBreak/>
               <w:drawing>
-                <wp:inline distT="0" distB="0" distL="0" distR="0" wp14:anchorId="69F16FF3" wp14:editId="6E60B250">
-                  <wp:extent cx="2599738" cy="5626100"/>
+                <wp:anchor distT="0" distB="0" distL="114300" distR="114300" simplePos="0" relativeHeight="251661312" behindDoc="0" locked="0" layoutInCell="1" allowOverlap="1" wp14:anchorId="02B0834A" wp14:editId="46EA8D39">
+                  <wp:simplePos x="0" y="0"/>
+                  <wp:positionH relativeFrom="column">
+                    <wp:posOffset>-65405</wp:posOffset>
+                  </wp:positionH>
+                  <wp:positionV relativeFrom="paragraph">
+                    <wp:posOffset>4445</wp:posOffset>
+                  </wp:positionV>
+                  <wp:extent cx="1849120" cy="4077335"/>
                   <wp:effectExtent l="0" t="0" r="0" b="0"/>
-                  <wp:docPr id="453873431" name="Imagen 4"/>
+                  <wp:wrapTopAndBottom/>
+                  <wp:docPr id="967638412" name="Imagen 4"/>
                   <wp:cNvGraphicFramePr>
                     <a:graphicFrameLocks xmlns:a="http://schemas.openxmlformats.org/drawingml/2006/main" noChangeAspect="1"/>
                   </wp:cNvGraphicFramePr>
@@ -2945,7 +2998,7 @@
                         <pic:spPr>
                           <a:xfrm>
                             <a:off x="0" y="0"/>
-                            <a:ext cx="2602376" cy="5631809"/>
+                            <a:ext cx="1849120" cy="4077335"/>
                           </a:xfrm>
                           <a:prstGeom prst="rect">
                             <a:avLst/>
@@ -2954,21 +3007,38 @@
                       </pic:pic>
                     </a:graphicData>
                   </a:graphic>
-                </wp:inline>
+                  <wp14:sizeRelH relativeFrom="margin">
+                    <wp14:pctWidth>0</wp14:pctWidth>
+                  </wp14:sizeRelH>
+                  <wp14:sizeRelV relativeFrom="margin">
+                    <wp14:pctHeight>0</wp14:pctHeight>
+                  </wp14:sizeRelV>
+                </wp:anchor>
               </w:drawing>
             </w:r>
+            <w:proofErr w:type="spellStart"/>
+            <w:r>
+              <w:rPr>
+                <w:sz w:val="22"/>
+                <w:szCs w:val="22"/>
+                <w:u w:val="single"/>
+              </w:rPr>
+              <w:t>Onboarding</w:t>
+            </w:r>
+            <w:proofErr w:type="spellEnd"/>
           </w:p>
         </w:tc>
         <w:tc>
           <w:tcPr>
-            <w:tcW w:w="4247" w:type="dxa"/>
+            <w:tcW w:w="2876" w:type="dxa"/>
           </w:tcPr>
           <w:p>
             <w:pPr>
-              <w:jc w:val="both"/>
-              <w:rPr>
-                <w:b/>
-                <w:bCs/>
+              <w:jc w:val="center"/>
+              <w:rPr>
+                <w:sz w:val="22"/>
+                <w:szCs w:val="22"/>
+                <w:u w:val="single"/>
               </w:rPr>
             </w:pPr>
             <w:r>
@@ -2978,10 +3048,18 @@
                 <w:noProof/>
               </w:rPr>
               <w:drawing>
-                <wp:inline distT="0" distB="0" distL="0" distR="0" wp14:anchorId="19A09977" wp14:editId="4FAAFC62">
-                  <wp:extent cx="2599739" cy="5626100"/>
-                  <wp:effectExtent l="0" t="0" r="0" b="0"/>
-                  <wp:docPr id="371150685" name="Imagen 3"/>
+                <wp:anchor distT="0" distB="0" distL="114300" distR="114300" simplePos="0" relativeHeight="251662336" behindDoc="0" locked="0" layoutInCell="1" allowOverlap="1" wp14:anchorId="56F964B6" wp14:editId="12545230">
+                  <wp:simplePos x="0" y="0"/>
+                  <wp:positionH relativeFrom="column">
+                    <wp:posOffset>-64885</wp:posOffset>
+                  </wp:positionH>
+                  <wp:positionV relativeFrom="paragraph">
+                    <wp:posOffset>3117</wp:posOffset>
+                  </wp:positionV>
+                  <wp:extent cx="1885544" cy="4080510"/>
+                  <wp:effectExtent l="0" t="0" r="635" b="0"/>
+                  <wp:wrapTopAndBottom/>
+                  <wp:docPr id="445112893" name="Imagen 3"/>
                   <wp:cNvGraphicFramePr>
                     <a:graphicFrameLocks xmlns:a="http://schemas.openxmlformats.org/drawingml/2006/main" noChangeAspect="1"/>
                   </wp:cNvGraphicFramePr>
@@ -3007,7 +3085,7 @@
                         <pic:spPr>
                           <a:xfrm>
                             <a:off x="0" y="0"/>
-                            <a:ext cx="2613536" cy="5655959"/>
+                            <a:ext cx="1885544" cy="4080510"/>
                           </a:xfrm>
                           <a:prstGeom prst="rect">
                             <a:avLst/>
@@ -3016,203 +3094,36 @@
                       </pic:pic>
                     </a:graphicData>
                   </a:graphic>
-                </wp:inline>
+                  <wp14:sizeRelH relativeFrom="margin">
+                    <wp14:pctWidth>0</wp14:pctWidth>
+                  </wp14:sizeRelH>
+                  <wp14:sizeRelV relativeFrom="margin">
+                    <wp14:pctHeight>0</wp14:pctHeight>
+                  </wp14:sizeRelV>
+                </wp:anchor>
               </w:drawing>
+            </w:r>
+            <w:r>
+              <w:rPr>
+                <w:sz w:val="22"/>
+                <w:szCs w:val="22"/>
+                <w:u w:val="single"/>
+              </w:rPr>
+              <w:t>Nivel de curso</w:t>
             </w:r>
           </w:p>
         </w:tc>
-      </w:tr>
-    </w:tbl>
-    <w:p>
-      <w:pPr>
-        <w:jc w:val="both"/>
-        <w:rPr>
-          <w:b/>
-          <w:bCs/>
-        </w:rPr>
-      </w:pPr>
-    </w:p>
-    <w:p>
-      <w:pPr>
-        <w:jc w:val="both"/>
-        <w:rPr>
-          <w:sz w:val="22"/>
-          <w:szCs w:val="22"/>
-        </w:rPr>
-      </w:pPr>
-      <w:r>
-        <w:rPr>
-          <w:sz w:val="22"/>
-          <w:szCs w:val="22"/>
-          <w:u w:val="single"/>
-        </w:rPr>
-        <w:t>Flujo</w:t>
-      </w:r>
-      <w:r>
-        <w:rPr>
-          <w:sz w:val="22"/>
-          <w:szCs w:val="22"/>
-        </w:rPr>
-        <w:t xml:space="preserve">: </w:t>
-      </w:r>
-      <w:r>
-        <w:rPr>
-          <w:sz w:val="22"/>
-          <w:szCs w:val="22"/>
-        </w:rPr>
-        <w:t xml:space="preserve">AMI abre en el </w:t>
-      </w:r>
-      <w:proofErr w:type="spellStart"/>
-      <w:r>
-        <w:rPr>
-          <w:sz w:val="22"/>
-          <w:szCs w:val="22"/>
-        </w:rPr>
-        <w:t>onboarding</w:t>
-      </w:r>
-      <w:proofErr w:type="spellEnd"/>
-      <w:r>
-        <w:rPr>
-          <w:sz w:val="22"/>
-          <w:szCs w:val="22"/>
-        </w:rPr>
-        <w:t xml:space="preserve"> (1)</w:t>
-      </w:r>
-      <w:r>
-        <w:rPr>
-          <w:sz w:val="22"/>
-          <w:szCs w:val="22"/>
-        </w:rPr>
-        <w:t>: el chico elige una de cuatro mascotas y, si es la primera vez, ingresa el código de clase que le dio la seño</w:t>
-      </w:r>
-      <w:r>
-        <w:rPr>
-          <w:sz w:val="22"/>
-          <w:szCs w:val="22"/>
-        </w:rPr>
-        <w:t>,</w:t>
-      </w:r>
-      <w:r>
-        <w:rPr>
-          <w:sz w:val="22"/>
-          <w:szCs w:val="22"/>
-        </w:rPr>
-        <w:t xml:space="preserve"> el único dato que pide la app antes de jugar. De ahí pasa directo a la pantalla de aprendizaje, donde practica el nivel en curso</w:t>
-      </w:r>
-      <w:r>
-        <w:rPr>
-          <w:sz w:val="22"/>
-          <w:szCs w:val="22"/>
-        </w:rPr>
-        <w:t xml:space="preserve"> (2)</w:t>
-      </w:r>
-      <w:r>
-        <w:rPr>
-          <w:sz w:val="22"/>
-          <w:szCs w:val="22"/>
-        </w:rPr>
-        <w:t>: toca el cuadrado con el sonido (una letra o una palabra), lo escucha, y confirma con su propia voz al micrófono que lo dice bien</w:t>
-      </w:r>
-      <w:r>
-        <w:rPr>
-          <w:sz w:val="22"/>
-          <w:szCs w:val="22"/>
-        </w:rPr>
-        <w:t>,</w:t>
-      </w:r>
-      <w:r>
-        <w:rPr>
-          <w:sz w:val="22"/>
-          <w:szCs w:val="22"/>
-        </w:rPr>
-        <w:t xml:space="preserve"> el pico de la sesión, descripto en la sección 3.2. Al completarlo</w:t>
-      </w:r>
-      <w:r>
-        <w:rPr>
-          <w:sz w:val="22"/>
-          <w:szCs w:val="22"/>
-        </w:rPr>
-        <w:t xml:space="preserve"> (3)</w:t>
-      </w:r>
-      <w:r>
-        <w:rPr>
-          <w:sz w:val="22"/>
-          <w:szCs w:val="22"/>
-        </w:rPr>
-        <w:t>, la sesión cierra con la mascota en grande, las estrellas ganadas y un adelanto borroso de lo que viene mañana, sin comparar con otros chicos ni penalizar si no vuelve</w:t>
-      </w:r>
-      <w:r>
-        <w:rPr>
-          <w:sz w:val="22"/>
-          <w:szCs w:val="22"/>
-        </w:rPr>
-        <w:t xml:space="preserve">, </w:t>
-      </w:r>
-      <w:r>
-        <w:rPr>
-          <w:sz w:val="22"/>
-          <w:szCs w:val="22"/>
-        </w:rPr>
-        <w:t xml:space="preserve">el final típico, también de la sección 3.2. Las tres pantallas son coherentes con el costo de entrada mínimo y con el pilar de </w:t>
-      </w:r>
-      <w:proofErr w:type="spellStart"/>
-      <w:r>
-        <w:rPr>
-          <w:sz w:val="22"/>
-          <w:szCs w:val="22"/>
-        </w:rPr>
-        <w:t>feedback</w:t>
-      </w:r>
-      <w:proofErr w:type="spellEnd"/>
-      <w:r>
-        <w:rPr>
-          <w:sz w:val="22"/>
-          <w:szCs w:val="22"/>
-        </w:rPr>
-        <w:t>: la mascota es el vehículo de todo el refuerzo positivo, nunca el texto.</w:t>
-      </w:r>
-    </w:p>
-    <w:p>
-      <w:pPr>
-        <w:jc w:val="both"/>
-        <w:rPr>
-          <w:b/>
-          <w:bCs/>
-        </w:rPr>
-      </w:pPr>
-    </w:p>
-    <w:p>
-      <w:pPr>
-        <w:jc w:val="both"/>
-        <w:rPr>
-          <w:b/>
-          <w:bCs/>
-        </w:rPr>
-      </w:pPr>
-    </w:p>
-    <w:tbl>
-      <w:tblPr>
-        <w:tblStyle w:val="Tablaconcuadrcula"/>
-        <w:tblW w:w="0" w:type="auto"/>
-        <w:tblLook w:val="04A0" w:firstRow="1" w:lastRow="0" w:firstColumn="1" w:lastColumn="0" w:noHBand="0" w:noVBand="1"/>
-      </w:tblPr>
-      <w:tblGrid>
-        <w:gridCol w:w="3465"/>
-      </w:tblGrid>
-      <w:tr>
-        <w:trPr>
-          <w:trHeight w:val="7014"/>
-        </w:trPr>
         <w:tc>
           <w:tcPr>
-            <w:tcW w:w="3444" w:type="dxa"/>
+            <w:tcW w:w="2795" w:type="dxa"/>
           </w:tcPr>
           <w:p>
             <w:pPr>
-              <w:jc w:val="both"/>
-              <w:rPr>
-                <w:b/>
-                <w:bCs/>
+              <w:jc w:val="center"/>
+              <w:rPr>
+                <w:sz w:val="22"/>
+                <w:szCs w:val="22"/>
+                <w:u w:val="single"/>
               </w:rPr>
             </w:pPr>
             <w:r>
@@ -3221,12 +3132,19 @@
                 <w:bCs/>
                 <w:noProof/>
               </w:rPr>
-              <w:lastRenderedPageBreak/>
               <w:drawing>
-                <wp:inline distT="0" distB="0" distL="0" distR="0" wp14:anchorId="6F67A4E3" wp14:editId="68465309">
-                  <wp:extent cx="2063522" cy="4465675"/>
-                  <wp:effectExtent l="0" t="0" r="0" b="0"/>
-                  <wp:docPr id="401190275" name="Imagen 1"/>
+                <wp:anchor distT="0" distB="0" distL="114300" distR="114300" simplePos="0" relativeHeight="251660288" behindDoc="1" locked="0" layoutInCell="1" allowOverlap="1" wp14:anchorId="1FFF667A" wp14:editId="5B127602">
+                  <wp:simplePos x="0" y="0"/>
+                  <wp:positionH relativeFrom="column">
+                    <wp:posOffset>-65405</wp:posOffset>
+                  </wp:positionH>
+                  <wp:positionV relativeFrom="paragraph">
+                    <wp:posOffset>1905</wp:posOffset>
+                  </wp:positionV>
+                  <wp:extent cx="1821815" cy="4080510"/>
+                  <wp:effectExtent l="0" t="0" r="6985" b="0"/>
+                  <wp:wrapTopAndBottom/>
+                  <wp:docPr id="323406402" name="Imagen 1"/>
                   <wp:cNvGraphicFramePr>
                     <a:graphicFrameLocks xmlns:a="http://schemas.openxmlformats.org/drawingml/2006/main" noChangeAspect="1"/>
                   </wp:cNvGraphicFramePr>
@@ -3252,7 +3170,7 @@
                         <pic:spPr>
                           <a:xfrm>
                             <a:off x="0" y="0"/>
-                            <a:ext cx="2076307" cy="4493342"/>
+                            <a:ext cx="1821815" cy="4080510"/>
                           </a:xfrm>
                           <a:prstGeom prst="rect">
                             <a:avLst/>
@@ -3261,8 +3179,22 @@
                       </pic:pic>
                     </a:graphicData>
                   </a:graphic>
-                </wp:inline>
+                  <wp14:sizeRelH relativeFrom="margin">
+                    <wp14:pctWidth>0</wp14:pctWidth>
+                  </wp14:sizeRelH>
+                  <wp14:sizeRelV relativeFrom="margin">
+                    <wp14:pctHeight>0</wp14:pctHeight>
+                  </wp14:sizeRelV>
+                </wp:anchor>
               </w:drawing>
+            </w:r>
+            <w:r>
+              <w:rPr>
+                <w:sz w:val="22"/>
+                <w:szCs w:val="22"/>
+                <w:u w:val="single"/>
+              </w:rPr>
+              <w:t>Nivel completo</w:t>
             </w:r>
           </w:p>
         </w:tc>
@@ -3272,14 +3204,171 @@
       <w:pPr>
         <w:jc w:val="both"/>
         <w:rPr>
-          <w:b/>
-          <w:bCs/>
-        </w:rPr>
-      </w:pPr>
-    </w:p>
-    <w:p>
-      <w:pPr>
-        <w:pStyle w:val="Ttulo2"/>
+          <w:sz w:val="22"/>
+          <w:szCs w:val="22"/>
+          <w:u w:val="single"/>
+        </w:rPr>
+      </w:pPr>
+    </w:p>
+    <w:p>
+      <w:pPr>
+        <w:jc w:val="both"/>
+        <w:rPr>
+          <w:sz w:val="22"/>
+          <w:szCs w:val="22"/>
+        </w:rPr>
+      </w:pPr>
+      <w:r>
+        <w:rPr>
+          <w:sz w:val="22"/>
+          <w:szCs w:val="22"/>
+          <w:u w:val="single"/>
+        </w:rPr>
+        <w:t>Flujo</w:t>
+      </w:r>
+      <w:r>
+        <w:rPr>
+          <w:sz w:val="22"/>
+          <w:szCs w:val="22"/>
+        </w:rPr>
+        <w:t xml:space="preserve">: </w:t>
+      </w:r>
+      <w:r>
+        <w:rPr>
+          <w:sz w:val="22"/>
+          <w:szCs w:val="22"/>
+        </w:rPr>
+        <w:t xml:space="preserve">AMI abre en el </w:t>
+      </w:r>
+      <w:proofErr w:type="spellStart"/>
+      <w:r>
+        <w:rPr>
+          <w:sz w:val="22"/>
+          <w:szCs w:val="22"/>
+        </w:rPr>
+        <w:t>onboarding</w:t>
+      </w:r>
+      <w:proofErr w:type="spellEnd"/>
+      <w:r>
+        <w:rPr>
+          <w:sz w:val="22"/>
+          <w:szCs w:val="22"/>
+        </w:rPr>
+        <w:t xml:space="preserve"> (1)</w:t>
+      </w:r>
+      <w:r>
+        <w:rPr>
+          <w:sz w:val="22"/>
+          <w:szCs w:val="22"/>
+        </w:rPr>
+        <w:t>: el chico elige una de cuatro mascotas y, si es la primera vez, ingresa el código de clase que le dio la seño</w:t>
+      </w:r>
+      <w:r>
+        <w:rPr>
+          <w:sz w:val="22"/>
+          <w:szCs w:val="22"/>
+        </w:rPr>
+        <w:t>,</w:t>
+      </w:r>
+      <w:r>
+        <w:rPr>
+          <w:sz w:val="22"/>
+          <w:szCs w:val="22"/>
+        </w:rPr>
+        <w:t xml:space="preserve"> el único dato que pide la </w:t>
+      </w:r>
+      <w:proofErr w:type="gramStart"/>
+      <w:r>
+        <w:rPr>
+          <w:sz w:val="22"/>
+          <w:szCs w:val="22"/>
+        </w:rPr>
+        <w:t>app</w:t>
+      </w:r>
+      <w:proofErr w:type="gramEnd"/>
+      <w:r>
+        <w:rPr>
+          <w:sz w:val="22"/>
+          <w:szCs w:val="22"/>
+        </w:rPr>
+        <w:t xml:space="preserve"> antes de jugar. De ahí pasa directo a la pantalla de aprendizaje, donde practica el nivel en curso</w:t>
+      </w:r>
+      <w:r>
+        <w:rPr>
+          <w:sz w:val="22"/>
+          <w:szCs w:val="22"/>
+        </w:rPr>
+        <w:t xml:space="preserve"> (2)</w:t>
+      </w:r>
+      <w:r>
+        <w:rPr>
+          <w:sz w:val="22"/>
+          <w:szCs w:val="22"/>
+        </w:rPr>
+        <w:t>: toca el cuadrado con el sonido (una letra o una palabra), lo escucha, y confirma con su propia voz al micrófono que lo dice bien</w:t>
+      </w:r>
+      <w:r>
+        <w:rPr>
+          <w:sz w:val="22"/>
+          <w:szCs w:val="22"/>
+        </w:rPr>
+        <w:t>,</w:t>
+      </w:r>
+      <w:r>
+        <w:rPr>
+          <w:sz w:val="22"/>
+          <w:szCs w:val="22"/>
+        </w:rPr>
+        <w:t xml:space="preserve"> el pico de la sesión, descripto en la sección 3.2. Al completarlo</w:t>
+      </w:r>
+      <w:r>
+        <w:rPr>
+          <w:sz w:val="22"/>
+          <w:szCs w:val="22"/>
+        </w:rPr>
+        <w:t xml:space="preserve"> (3)</w:t>
+      </w:r>
+      <w:r>
+        <w:rPr>
+          <w:sz w:val="22"/>
+          <w:szCs w:val="22"/>
+        </w:rPr>
+        <w:t>, la sesión cierra con la mascota en grande, las estrellas ganadas y un adelanto borroso de lo que viene mañana, sin comparar con otros chicos ni penalizar si no vuelve</w:t>
+      </w:r>
+      <w:r>
+        <w:rPr>
+          <w:sz w:val="22"/>
+          <w:szCs w:val="22"/>
+        </w:rPr>
+        <w:t xml:space="preserve">, </w:t>
+      </w:r>
+      <w:r>
+        <w:rPr>
+          <w:sz w:val="22"/>
+          <w:szCs w:val="22"/>
+        </w:rPr>
+        <w:t xml:space="preserve">el final típico, también de la sección 3.2. Las tres pantallas son coherentes con el costo de entrada mínimo y con el pilar de </w:t>
+      </w:r>
+      <w:proofErr w:type="spellStart"/>
+      <w:r>
+        <w:rPr>
+          <w:sz w:val="22"/>
+          <w:szCs w:val="22"/>
+        </w:rPr>
+        <w:t>feedback</w:t>
+      </w:r>
+      <w:proofErr w:type="spellEnd"/>
+      <w:r>
+        <w:rPr>
+          <w:sz w:val="22"/>
+          <w:szCs w:val="22"/>
+        </w:rPr>
+        <w:t>: la mascota es el vehículo de todo el refuerzo positivo, nunca el texto.</w:t>
+      </w:r>
+    </w:p>
+    <w:p>
+      <w:pPr>
+        <w:pStyle w:val="Heading2"/>
         <w:jc w:val="both"/>
         <w:rPr>
           <w:b/>
@@ -3359,7 +3448,7 @@
     </w:p>
     <w:p>
       <w:pPr>
-        <w:pStyle w:val="Ttulo2"/>
+        <w:pStyle w:val="Heading2"/>
         <w:jc w:val="both"/>
         <w:rPr>
           <w:b/>
@@ -3378,6 +3467,7 @@
           <w:sz w:val="24"/>
           <w:szCs w:val="24"/>
         </w:rPr>
+        <w:lastRenderedPageBreak/>
         <w:t>La app como instrumento de investigación</w:t>
       </w:r>
       <w:bookmarkEnd w:id="14"/>
@@ -3457,15 +3547,7 @@
           <w:sz w:val="22"/>
           <w:szCs w:val="22"/>
         </w:rPr>
-        <w:t xml:space="preserve"> un grupo de clases con la secuencia partida (los niveles 8, 9 y 10 tal como están diseñados) y otro con la unidad entera en un solo nivel, como viene en el cuadernillo. Mismo tiempo total, distinta fragmentación. Así se distingue el efecto de la fragmentación del efecto del tiempo dedicado. Vale la pena porque es una decisión de </w:t>
-      </w:r>
-      <w:r>
-        <w:rPr>
-          <w:sz w:val="22"/>
-          <w:szCs w:val="22"/>
-        </w:rPr>
-        <w:lastRenderedPageBreak/>
-        <w:t>diseño que ya tomamos y que afecta a todo el producto: si el experimento la desmiente, hay que rediseñar la estructura de niveles, no un detalle.</w:t>
+        <w:t xml:space="preserve"> un grupo de clases con la secuencia partida (los niveles 8, 9 y 10 tal como están diseñados) y otro con la unidad entera en un solo nivel, como viene en el cuadernillo. Mismo tiempo total, distinta fragmentación. Así se distingue el efecto de la fragmentación del efecto del tiempo dedicado. Vale la pena porque es una decisión de diseño que ya tomamos y que afecta a todo el producto: si el experimento la desmiente, hay que rediseñar la estructura de niveles, no un detalle.</w:t>
       </w:r>
     </w:p>
     <w:p>
@@ -3509,7 +3591,7 @@
     </w:p>
     <w:p>
       <w:pPr>
-        <w:pStyle w:val="Ttulo2"/>
+        <w:pStyle w:val="Heading2"/>
         <w:jc w:val="both"/>
         <w:rPr>
           <w:b/>
@@ -5013,11 +5095,11 @@
     <w:name w:val="Normal"/>
     <w:qFormat/>
   </w:style>
-  <w:style w:type="paragraph" w:styleId="Ttulo1">
+  <w:style w:type="paragraph" w:styleId="Heading1">
     <w:name w:val="heading 1"/>
     <w:basedOn w:val="Normal"/>
     <w:next w:val="Normal"/>
-    <w:link w:val="Ttulo1Car"/>
+    <w:link w:val="Heading1Char"/>
     <w:uiPriority w:val="9"/>
     <w:qFormat/>
     <w:rsid w:val="00093140"/>
@@ -5034,11 +5116,11 @@
       <w:szCs w:val="40"/>
     </w:rPr>
   </w:style>
-  <w:style w:type="paragraph" w:styleId="Ttulo2">
+  <w:style w:type="paragraph" w:styleId="Heading2">
     <w:name w:val="heading 2"/>
     <w:basedOn w:val="Normal"/>
     <w:next w:val="Normal"/>
-    <w:link w:val="Ttulo2Car"/>
+    <w:link w:val="Heading2Char"/>
     <w:uiPriority w:val="9"/>
     <w:unhideWhenUsed/>
     <w:qFormat/>
@@ -5056,11 +5138,11 @@
       <w:szCs w:val="32"/>
     </w:rPr>
   </w:style>
-  <w:style w:type="paragraph" w:styleId="Ttulo3">
+  <w:style w:type="paragraph" w:styleId="Heading3">
     <w:name w:val="heading 3"/>
     <w:basedOn w:val="Normal"/>
     <w:next w:val="Normal"/>
-    <w:link w:val="Ttulo3Car"/>
+    <w:link w:val="Heading3Char"/>
     <w:uiPriority w:val="9"/>
     <w:unhideWhenUsed/>
     <w:qFormat/>
@@ -5078,11 +5160,11 @@
       <w:szCs w:val="28"/>
     </w:rPr>
   </w:style>
-  <w:style w:type="paragraph" w:styleId="Ttulo4">
+  <w:style w:type="paragraph" w:styleId="Heading4">
     <w:name w:val="heading 4"/>
     <w:basedOn w:val="Normal"/>
     <w:next w:val="Normal"/>
-    <w:link w:val="Ttulo4Car"/>
+    <w:link w:val="Heading4Char"/>
     <w:uiPriority w:val="9"/>
     <w:semiHidden/>
     <w:unhideWhenUsed/>
@@ -5101,11 +5183,11 @@
       <w:color w:val="0F4761" w:themeColor="accent1" w:themeShade="BF"/>
     </w:rPr>
   </w:style>
-  <w:style w:type="paragraph" w:styleId="Ttulo5">
+  <w:style w:type="paragraph" w:styleId="Heading5">
     <w:name w:val="heading 5"/>
     <w:basedOn w:val="Normal"/>
     <w:next w:val="Normal"/>
-    <w:link w:val="Ttulo5Car"/>
+    <w:link w:val="Heading5Char"/>
     <w:uiPriority w:val="9"/>
     <w:semiHidden/>
     <w:unhideWhenUsed/>
@@ -5122,11 +5204,11 @@
       <w:color w:val="0F4761" w:themeColor="accent1" w:themeShade="BF"/>
     </w:rPr>
   </w:style>
-  <w:style w:type="paragraph" w:styleId="Ttulo6">
+  <w:style w:type="paragraph" w:styleId="Heading6">
     <w:name w:val="heading 6"/>
     <w:basedOn w:val="Normal"/>
     <w:next w:val="Normal"/>
-    <w:link w:val="Ttulo6Car"/>
+    <w:link w:val="Heading6Char"/>
     <w:uiPriority w:val="9"/>
     <w:semiHidden/>
     <w:unhideWhenUsed/>
@@ -5145,11 +5227,11 @@
       <w:color w:val="595959" w:themeColor="text1" w:themeTint="A6"/>
     </w:rPr>
   </w:style>
-  <w:style w:type="paragraph" w:styleId="Ttulo7">
+  <w:style w:type="paragraph" w:styleId="Heading7">
     <w:name w:val="heading 7"/>
     <w:basedOn w:val="Normal"/>
     <w:next w:val="Normal"/>
-    <w:link w:val="Ttulo7Car"/>
+    <w:link w:val="Heading7Char"/>
     <w:uiPriority w:val="9"/>
     <w:semiHidden/>
     <w:unhideWhenUsed/>
@@ -5166,11 +5248,11 @@
       <w:color w:val="595959" w:themeColor="text1" w:themeTint="A6"/>
     </w:rPr>
   </w:style>
-  <w:style w:type="paragraph" w:styleId="Ttulo8">
+  <w:style w:type="paragraph" w:styleId="Heading8">
     <w:name w:val="heading 8"/>
     <w:basedOn w:val="Normal"/>
     <w:next w:val="Normal"/>
-    <w:link w:val="Ttulo8Car"/>
+    <w:link w:val="Heading8Char"/>
     <w:uiPriority w:val="9"/>
     <w:semiHidden/>
     <w:unhideWhenUsed/>
@@ -5189,11 +5271,11 @@
       <w:color w:val="272727" w:themeColor="text1" w:themeTint="D8"/>
     </w:rPr>
   </w:style>
-  <w:style w:type="paragraph" w:styleId="Ttulo9">
+  <w:style w:type="paragraph" w:styleId="Heading9">
     <w:name w:val="heading 9"/>
     <w:basedOn w:val="Normal"/>
     <w:next w:val="Normal"/>
-    <w:link w:val="Ttulo9Car"/>
+    <w:link w:val="Heading9Char"/>
     <w:uiPriority w:val="9"/>
     <w:semiHidden/>
     <w:unhideWhenUsed/>
@@ -5210,12 +5292,13 @@
       <w:color w:val="272727" w:themeColor="text1" w:themeTint="D8"/>
     </w:rPr>
   </w:style>
-  <w:style w:type="character" w:default="1" w:styleId="Fuentedeprrafopredeter">
+  <w:style w:type="character" w:default="1" w:styleId="DefaultParagraphFont">
     <w:name w:val="Default Paragraph Font"/>
     <w:uiPriority w:val="1"/>
+    <w:semiHidden/>
     <w:unhideWhenUsed/>
   </w:style>
-  <w:style w:type="table" w:default="1" w:styleId="Tablanormal">
+  <w:style w:type="table" w:default="1" w:styleId="TableNormal">
     <w:name w:val="Normal Table"/>
     <w:uiPriority w:val="99"/>
     <w:semiHidden/>
@@ -5230,16 +5313,16 @@
       </w:tblCellMar>
     </w:tblPr>
   </w:style>
-  <w:style w:type="numbering" w:default="1" w:styleId="Sinlista">
+  <w:style w:type="numbering" w:default="1" w:styleId="NoList">
     <w:name w:val="No List"/>
     <w:uiPriority w:val="99"/>
     <w:semiHidden/>
     <w:unhideWhenUsed/>
   </w:style>
-  <w:style w:type="character" w:customStyle="1" w:styleId="Ttulo1Car">
-    <w:name w:val="Título 1 Car"/>
-    <w:basedOn w:val="Fuentedeprrafopredeter"/>
-    <w:link w:val="Ttulo1"/>
+  <w:style w:type="character" w:customStyle="1" w:styleId="Heading1Char">
+    <w:name w:val="Heading 1 Char"/>
+    <w:basedOn w:val="DefaultParagraphFont"/>
+    <w:link w:val="Heading1"/>
     <w:uiPriority w:val="9"/>
     <w:rsid w:val="00093140"/>
     <w:rPr>
@@ -5249,10 +5332,10 @@
       <w:szCs w:val="40"/>
     </w:rPr>
   </w:style>
-  <w:style w:type="character" w:customStyle="1" w:styleId="Ttulo2Car">
-    <w:name w:val="Título 2 Car"/>
-    <w:basedOn w:val="Fuentedeprrafopredeter"/>
-    <w:link w:val="Ttulo2"/>
+  <w:style w:type="character" w:customStyle="1" w:styleId="Heading2Char">
+    <w:name w:val="Heading 2 Char"/>
+    <w:basedOn w:val="DefaultParagraphFont"/>
+    <w:link w:val="Heading2"/>
     <w:uiPriority w:val="9"/>
     <w:rsid w:val="00093140"/>
     <w:rPr>
@@ -5262,10 +5345,10 @@
       <w:szCs w:val="32"/>
     </w:rPr>
   </w:style>
-  <w:style w:type="character" w:customStyle="1" w:styleId="Ttulo3Car">
-    <w:name w:val="Título 3 Car"/>
-    <w:basedOn w:val="Fuentedeprrafopredeter"/>
-    <w:link w:val="Ttulo3"/>
+  <w:style w:type="character" w:customStyle="1" w:styleId="Heading3Char">
+    <w:name w:val="Heading 3 Char"/>
+    <w:basedOn w:val="DefaultParagraphFont"/>
+    <w:link w:val="Heading3"/>
     <w:uiPriority w:val="9"/>
     <w:rsid w:val="00093140"/>
     <w:rPr>
@@ -5275,10 +5358,10 @@
       <w:szCs w:val="28"/>
     </w:rPr>
   </w:style>
-  <w:style w:type="character" w:customStyle="1" w:styleId="Ttulo4Car">
-    <w:name w:val="Título 4 Car"/>
-    <w:basedOn w:val="Fuentedeprrafopredeter"/>
-    <w:link w:val="Ttulo4"/>
+  <w:style w:type="character" w:customStyle="1" w:styleId="Heading4Char">
+    <w:name w:val="Heading 4 Char"/>
+    <w:basedOn w:val="DefaultParagraphFont"/>
+    <w:link w:val="Heading4"/>
     <w:uiPriority w:val="9"/>
     <w:semiHidden/>
     <w:rsid w:val="00093140"/>
@@ -5289,10 +5372,10 @@
       <w:color w:val="0F4761" w:themeColor="accent1" w:themeShade="BF"/>
     </w:rPr>
   </w:style>
-  <w:style w:type="character" w:customStyle="1" w:styleId="Ttulo5Car">
-    <w:name w:val="Título 5 Car"/>
-    <w:basedOn w:val="Fuentedeprrafopredeter"/>
-    <w:link w:val="Ttulo5"/>
+  <w:style w:type="character" w:customStyle="1" w:styleId="Heading5Char">
+    <w:name w:val="Heading 5 Char"/>
+    <w:basedOn w:val="DefaultParagraphFont"/>
+    <w:link w:val="Heading5"/>
     <w:uiPriority w:val="9"/>
     <w:semiHidden/>
     <w:rsid w:val="00093140"/>
@@ -5301,10 +5384,10 @@
       <w:color w:val="0F4761" w:themeColor="accent1" w:themeShade="BF"/>
     </w:rPr>
   </w:style>
-  <w:style w:type="character" w:customStyle="1" w:styleId="Ttulo6Car">
-    <w:name w:val="Título 6 Car"/>
-    <w:basedOn w:val="Fuentedeprrafopredeter"/>
-    <w:link w:val="Ttulo6"/>
+  <w:style w:type="character" w:customStyle="1" w:styleId="Heading6Char">
+    <w:name w:val="Heading 6 Char"/>
+    <w:basedOn w:val="DefaultParagraphFont"/>
+    <w:link w:val="Heading6"/>
     <w:uiPriority w:val="9"/>
     <w:semiHidden/>
     <w:rsid w:val="00093140"/>
@@ -5315,10 +5398,10 @@
       <w:color w:val="595959" w:themeColor="text1" w:themeTint="A6"/>
     </w:rPr>
   </w:style>
-  <w:style w:type="character" w:customStyle="1" w:styleId="Ttulo7Car">
-    <w:name w:val="Título 7 Car"/>
-    <w:basedOn w:val="Fuentedeprrafopredeter"/>
-    <w:link w:val="Ttulo7"/>
+  <w:style w:type="character" w:customStyle="1" w:styleId="Heading7Char">
+    <w:name w:val="Heading 7 Char"/>
+    <w:basedOn w:val="DefaultParagraphFont"/>
+    <w:link w:val="Heading7"/>
     <w:uiPriority w:val="9"/>
     <w:semiHidden/>
     <w:rsid w:val="00093140"/>
@@ -5327,10 +5410,10 @@
       <w:color w:val="595959" w:themeColor="text1" w:themeTint="A6"/>
     </w:rPr>
   </w:style>
-  <w:style w:type="character" w:customStyle="1" w:styleId="Ttulo8Car">
-    <w:name w:val="Título 8 Car"/>
-    <w:basedOn w:val="Fuentedeprrafopredeter"/>
-    <w:link w:val="Ttulo8"/>
+  <w:style w:type="character" w:customStyle="1" w:styleId="Heading8Char">
+    <w:name w:val="Heading 8 Char"/>
+    <w:basedOn w:val="DefaultParagraphFont"/>
+    <w:link w:val="Heading8"/>
     <w:uiPriority w:val="9"/>
     <w:semiHidden/>
     <w:rsid w:val="00093140"/>
@@ -5341,10 +5424,10 @@
       <w:color w:val="272727" w:themeColor="text1" w:themeTint="D8"/>
     </w:rPr>
   </w:style>
-  <w:style w:type="character" w:customStyle="1" w:styleId="Ttulo9Car">
-    <w:name w:val="Título 9 Car"/>
-    <w:basedOn w:val="Fuentedeprrafopredeter"/>
-    <w:link w:val="Ttulo9"/>
+  <w:style w:type="character" w:customStyle="1" w:styleId="Heading9Char">
+    <w:name w:val="Heading 9 Char"/>
+    <w:basedOn w:val="DefaultParagraphFont"/>
+    <w:link w:val="Heading9"/>
     <w:uiPriority w:val="9"/>
     <w:semiHidden/>
     <w:rsid w:val="00093140"/>
@@ -5353,11 +5436,11 @@
       <w:color w:val="272727" w:themeColor="text1" w:themeTint="D8"/>
     </w:rPr>
   </w:style>
-  <w:style w:type="paragraph" w:styleId="Ttulo">
+  <w:style w:type="paragraph" w:styleId="Title">
     <w:name w:val="Title"/>
     <w:basedOn w:val="Normal"/>
     <w:next w:val="Normal"/>
-    <w:link w:val="TtuloCar"/>
+    <w:link w:val="TitleChar"/>
     <w:uiPriority w:val="10"/>
     <w:qFormat/>
     <w:rsid w:val="00093140"/>
@@ -5373,10 +5456,10 @@
       <w:szCs w:val="56"/>
     </w:rPr>
   </w:style>
-  <w:style w:type="character" w:customStyle="1" w:styleId="TtuloCar">
-    <w:name w:val="Título Car"/>
-    <w:basedOn w:val="Fuentedeprrafopredeter"/>
-    <w:link w:val="Ttulo"/>
+  <w:style w:type="character" w:customStyle="1" w:styleId="TitleChar">
+    <w:name w:val="Title Char"/>
+    <w:basedOn w:val="DefaultParagraphFont"/>
+    <w:link w:val="Title"/>
     <w:uiPriority w:val="10"/>
     <w:rsid w:val="00093140"/>
     <w:rPr>
@@ -5387,11 +5470,11 @@
       <w:szCs w:val="56"/>
     </w:rPr>
   </w:style>
-  <w:style w:type="paragraph" w:styleId="Subttulo">
+  <w:style w:type="paragraph" w:styleId="Subtitle">
     <w:name w:val="Subtitle"/>
     <w:basedOn w:val="Normal"/>
     <w:next w:val="Normal"/>
-    <w:link w:val="SubttuloCar"/>
+    <w:link w:val="SubtitleChar"/>
     <w:uiPriority w:val="11"/>
     <w:qFormat/>
     <w:rsid w:val="00093140"/>
@@ -5408,10 +5491,10 @@
       <w:szCs w:val="28"/>
     </w:rPr>
   </w:style>
-  <w:style w:type="character" w:customStyle="1" w:styleId="SubttuloCar">
-    <w:name w:val="Subtítulo Car"/>
-    <w:basedOn w:val="Fuentedeprrafopredeter"/>
-    <w:link w:val="Subttulo"/>
+  <w:style w:type="character" w:customStyle="1" w:styleId="SubtitleChar">
+    <w:name w:val="Subtitle Char"/>
+    <w:basedOn w:val="DefaultParagraphFont"/>
+    <w:link w:val="Subtitle"/>
     <w:uiPriority w:val="11"/>
     <w:rsid w:val="00093140"/>
     <w:rPr>
@@ -5422,11 +5505,11 @@
       <w:szCs w:val="28"/>
     </w:rPr>
   </w:style>
-  <w:style w:type="paragraph" w:styleId="Cita">
+  <w:style w:type="paragraph" w:styleId="Quote">
     <w:name w:val="Quote"/>
     <w:basedOn w:val="Normal"/>
     <w:next w:val="Normal"/>
-    <w:link w:val="CitaCar"/>
+    <w:link w:val="QuoteChar"/>
     <w:uiPriority w:val="29"/>
     <w:qFormat/>
     <w:rsid w:val="00093140"/>
@@ -5440,10 +5523,10 @@
       <w:color w:val="404040" w:themeColor="text1" w:themeTint="BF"/>
     </w:rPr>
   </w:style>
-  <w:style w:type="character" w:customStyle="1" w:styleId="CitaCar">
-    <w:name w:val="Cita Car"/>
-    <w:basedOn w:val="Fuentedeprrafopredeter"/>
-    <w:link w:val="Cita"/>
+  <w:style w:type="character" w:customStyle="1" w:styleId="QuoteChar">
+    <w:name w:val="Quote Char"/>
+    <w:basedOn w:val="DefaultParagraphFont"/>
+    <w:link w:val="Quote"/>
     <w:uiPriority w:val="29"/>
     <w:rsid w:val="00093140"/>
     <w:rPr>
@@ -5452,7 +5535,7 @@
       <w:color w:val="404040" w:themeColor="text1" w:themeTint="BF"/>
     </w:rPr>
   </w:style>
-  <w:style w:type="paragraph" w:styleId="Prrafodelista">
+  <w:style w:type="paragraph" w:styleId="ListParagraph">
     <w:name w:val="List Paragraph"/>
     <w:basedOn w:val="Normal"/>
     <w:uiPriority w:val="34"/>
@@ -5463,9 +5546,9 @@
       <w:contextualSpacing/>
     </w:pPr>
   </w:style>
-  <w:style w:type="character" w:styleId="nfasisintenso">
+  <w:style w:type="character" w:styleId="IntenseEmphasis">
     <w:name w:val="Intense Emphasis"/>
-    <w:basedOn w:val="Fuentedeprrafopredeter"/>
+    <w:basedOn w:val="DefaultParagraphFont"/>
     <w:uiPriority w:val="21"/>
     <w:qFormat/>
     <w:rsid w:val="00093140"/>
@@ -5475,11 +5558,11 @@
       <w:color w:val="0F4761" w:themeColor="accent1" w:themeShade="BF"/>
     </w:rPr>
   </w:style>
-  <w:style w:type="paragraph" w:styleId="Citadestacada">
+  <w:style w:type="paragraph" w:styleId="IntenseQuote">
     <w:name w:val="Intense Quote"/>
     <w:basedOn w:val="Normal"/>
     <w:next w:val="Normal"/>
-    <w:link w:val="CitadestacadaCar"/>
+    <w:link w:val="IntenseQuoteChar"/>
     <w:uiPriority w:val="30"/>
     <w:qFormat/>
     <w:rsid w:val="00093140"/>
@@ -5498,10 +5581,10 @@
       <w:color w:val="0F4761" w:themeColor="accent1" w:themeShade="BF"/>
     </w:rPr>
   </w:style>
-  <w:style w:type="character" w:customStyle="1" w:styleId="CitadestacadaCar">
-    <w:name w:val="Cita destacada Car"/>
-    <w:basedOn w:val="Fuentedeprrafopredeter"/>
-    <w:link w:val="Citadestacada"/>
+  <w:style w:type="character" w:customStyle="1" w:styleId="IntenseQuoteChar">
+    <w:name w:val="Intense Quote Char"/>
+    <w:basedOn w:val="DefaultParagraphFont"/>
+    <w:link w:val="IntenseQuote"/>
     <w:uiPriority w:val="30"/>
     <w:rsid w:val="00093140"/>
     <w:rPr>
@@ -5510,9 +5593,9 @@
       <w:color w:val="0F4761" w:themeColor="accent1" w:themeShade="BF"/>
     </w:rPr>
   </w:style>
-  <w:style w:type="character" w:styleId="Referenciaintensa">
+  <w:style w:type="character" w:styleId="IntenseReference">
     <w:name w:val="Intense Reference"/>
-    <w:basedOn w:val="Fuentedeprrafopredeter"/>
+    <w:basedOn w:val="DefaultParagraphFont"/>
     <w:uiPriority w:val="32"/>
     <w:qFormat/>
     <w:rsid w:val="00093140"/>
@@ -5524,9 +5607,9 @@
       <w:spacing w:val="5"/>
     </w:rPr>
   </w:style>
-  <w:style w:type="character" w:styleId="Hipervnculo">
+  <w:style w:type="character" w:styleId="Hyperlink">
     <w:name w:val="Hyperlink"/>
-    <w:basedOn w:val="Fuentedeprrafopredeter"/>
+    <w:basedOn w:val="DefaultParagraphFont"/>
     <w:uiPriority w:val="99"/>
     <w:unhideWhenUsed/>
     <w:rsid w:val="00093140"/>
@@ -5535,9 +5618,9 @@
       <w:u w:val="single"/>
     </w:rPr>
   </w:style>
-  <w:style w:type="character" w:styleId="Mencinsinresolver">
+  <w:style w:type="character" w:styleId="UnresolvedMention">
     <w:name w:val="Unresolved Mention"/>
-    <w:basedOn w:val="Fuentedeprrafopredeter"/>
+    <w:basedOn w:val="DefaultParagraphFont"/>
     <w:uiPriority w:val="99"/>
     <w:semiHidden/>
     <w:unhideWhenUsed/>
@@ -5547,9 +5630,9 @@
       <w:shd w:val="clear" w:color="auto" w:fill="E1DFDD"/>
     </w:rPr>
   </w:style>
-  <w:style w:type="paragraph" w:styleId="TtuloTDC">
+  <w:style w:type="paragraph" w:styleId="TOCHeading">
     <w:name w:val="TOC Heading"/>
-    <w:basedOn w:val="Ttulo1"/>
+    <w:basedOn w:val="Heading1"/>
     <w:next w:val="Normal"/>
     <w:uiPriority w:val="39"/>
     <w:unhideWhenUsed/>
@@ -5567,7 +5650,7 @@
       <w14:ligatures w14:val="none"/>
     </w:rPr>
   </w:style>
-  <w:style w:type="paragraph" w:styleId="TDC2">
+  <w:style w:type="paragraph" w:styleId="TOC2">
     <w:name w:val="toc 2"/>
     <w:basedOn w:val="Normal"/>
     <w:next w:val="Normal"/>
@@ -5580,7 +5663,7 @@
       <w:ind w:left="240"/>
     </w:pPr>
   </w:style>
-  <w:style w:type="paragraph" w:styleId="TDC3">
+  <w:style w:type="paragraph" w:styleId="TOC3">
     <w:name w:val="toc 3"/>
     <w:basedOn w:val="Normal"/>
     <w:next w:val="Normal"/>
@@ -5601,9 +5684,9 @@
       <w:noProof/>
     </w:rPr>
   </w:style>
-  <w:style w:type="table" w:styleId="Tablaconcuadrcula">
+  <w:style w:type="table" w:styleId="TableGrid">
     <w:name w:val="Table Grid"/>
-    <w:basedOn w:val="Tablanormal"/>
+    <w:basedOn w:val="TableNormal"/>
     <w:uiPriority w:val="39"/>
     <w:rsid w:val="001A6155"/>
     <w:pPr>

</xml_diff>